<commit_message>
Add real screenshots (Swagger, K8s pods, Prometheus, Grafana, MLflow comparison) and embed into report
</commit_message>
<xml_diff>
--- a/docs/report.docx
+++ b/docs/report.docx
@@ -10,7 +10,7 @@
         <w:t xml:space="preserve">MLOps Assignment 1 Report - Surbhi Arya</w:t>
       </w:r>
     </w:p>
-    <w:bookmarkStart w:id="38" w:name="Xba6b69b5c4941cb17d3d46ba9b8f512a4364fae"/>
+    <w:bookmarkStart w:id="74" w:name="Xba6b69b5c4941cb17d3d46ba9b8f512a4364fae"/>
     <w:p>
       <w:pPr>
         <w:pStyle w:val="Heading1"/>
@@ -1000,7 +1000,7 @@
       </w:r>
     </w:p>
     <w:bookmarkEnd w:id="23"/>
-    <w:bookmarkStart w:id="25" w:name="feature-engineering-modelling-choices"/>
+    <w:bookmarkStart w:id="43" w:name="feature-engineering-modelling-choices"/>
     <w:p>
       <w:pPr>
         <w:pStyle w:val="Heading2"/>
@@ -1628,7 +1628,7 @@
         <w:t xml:space="preserve">subsample</w:t>
       </w:r>
     </w:p>
-    <w:bookmarkStart w:id="24" w:name="results"/>
+    <w:bookmarkStart w:id="42" w:name="results"/>
     <w:p>
       <w:pPr>
         <w:pStyle w:val="Heading3"/>
@@ -2007,19 +2007,7 @@
         <w:t xml:space="preserve"> </w:t>
       </w:r>
       <w:r>
-        <w:t xml:space="preserve">feature-importance plots (logged as MLflow artifacts, viewable via</w:t>
-      </w:r>
-      <w:r>
-        <w:t xml:space="preserve"> </w:t>
-      </w:r>
-      <w:r>
-        <w:rPr>
-          <w:rStyle w:val="VerbatimChar"/>
-        </w:rPr>
-        <w:t xml:space="preserve">mlflow ui</w:t>
-      </w:r>
-      <w:r>
-        <w:t xml:space="preserve">) confirm</w:t>
+        <w:t xml:space="preserve">feature-importance plots confirm</w:t>
       </w:r>
       <w:r>
         <w:t xml:space="preserve"> </w:t>
@@ -2058,13 +2046,400 @@
         <w:t xml:space="preserve"> </w:t>
       </w:r>
       <w:r>
-        <w:t xml:space="preserve">as the top drivers for</w:t>
-      </w:r>
-      <w:r>
-        <w:t xml:space="preserve"> </w:t>
-      </w:r>
-      <w:r>
-        <w:t xml:space="preserve">both models, consistent with the EDA.</w:t>
+        <w:t xml:space="preserve">(labelled</w:t>
+      </w:r>
+      <w:r>
+        <w:t xml:space="preserve"> </w:t>
+      </w:r>
+      <w:r>
+        <w:rPr>
+          <w:rStyle w:val="VerbatimChar"/>
+        </w:rPr>
+        <w:t xml:space="preserve">ordinal__cp</w:t>
+      </w:r>
+      <w:r>
+        <w:t xml:space="preserve">,</w:t>
+      </w:r>
+      <w:r>
+        <w:t xml:space="preserve"> </w:t>
+      </w:r>
+      <w:r>
+        <w:rPr>
+          <w:rStyle w:val="VerbatimChar"/>
+        </w:rPr>
+        <w:t xml:space="preserve">ordinal__ca</w:t>
+      </w:r>
+      <w:r>
+        <w:t xml:space="preserve">,</w:t>
+      </w:r>
+      <w:r>
+        <w:t xml:space="preserve"> </w:t>
+      </w:r>
+      <w:r>
+        <w:rPr>
+          <w:rStyle w:val="VerbatimChar"/>
+        </w:rPr>
+        <w:t xml:space="preserve">numeric__oldpeak</w:t>
+      </w:r>
+      <w:r>
+        <w:t xml:space="preserve">,</w:t>
+      </w:r>
+      <w:r>
+        <w:t xml:space="preserve"> </w:t>
+      </w:r>
+      <w:r>
+        <w:rPr>
+          <w:rStyle w:val="VerbatimChar"/>
+        </w:rPr>
+        <w:t xml:space="preserve">ordinal__thal</w:t>
+      </w:r>
+      <w:r>
+        <w:t xml:space="preserve"> </w:t>
+      </w:r>
+      <w:r>
+        <w:t xml:space="preserve">after</w:t>
+      </w:r>
+      <w:r>
+        <w:t xml:space="preserve"> </w:t>
+      </w:r>
+      <w:r>
+        <w:t xml:space="preserve">the preprocessing pipeline) as the top drivers for both models,</w:t>
+      </w:r>
+      <w:r>
+        <w:t xml:space="preserve"> </w:t>
+      </w:r>
+      <w:r>
+        <w:t xml:space="preserve">consistent with the EDA.</w:t>
+      </w:r>
+    </w:p>
+    <w:p>
+      <w:pPr>
+        <w:pStyle w:val="CaptionedFigure"/>
+      </w:pPr>
+      <w:r>
+        <w:drawing>
+          <wp:inline>
+            <wp:extent cx="5334000" cy="3464277"/>
+            <wp:effectExtent b="0" l="0" r="0" t="0"/>
+            <wp:docPr descr="Decision Tree confusion matrix" title="" id="25" name="Picture"/>
+            <a:graphic>
+              <a:graphicData uri="http://schemas.openxmlformats.org/drawingml/2006/picture">
+                <pic:pic>
+                  <pic:nvPicPr>
+                    <pic:cNvPr descr="../screenshots/model/decision_tree_confusion_matrix.png" id="26" name="Picture"/>
+                    <pic:cNvPicPr>
+                      <a:picLocks noChangeArrowheads="1" noChangeAspect="1"/>
+                    </pic:cNvPicPr>
+                  </pic:nvPicPr>
+                  <pic:blipFill>
+                    <a:blip r:embed="rId24"/>
+                    <a:stretch>
+                      <a:fillRect/>
+                    </a:stretch>
+                  </pic:blipFill>
+                  <pic:spPr bwMode="auto">
+                    <a:xfrm>
+                      <a:off x="0" y="0"/>
+                      <a:ext cx="5334000" cy="3464277"/>
+                    </a:xfrm>
+                    <a:prstGeom prst="rect">
+                      <a:avLst/>
+                    </a:prstGeom>
+                    <a:noFill/>
+                    <a:ln w="9525">
+                      <a:noFill/>
+                      <a:headEnd/>
+                      <a:tailEnd/>
+                    </a:ln>
+                  </pic:spPr>
+                </pic:pic>
+              </a:graphicData>
+            </a:graphic>
+          </wp:inline>
+        </w:drawing>
+      </w:r>
+    </w:p>
+    <w:p>
+      <w:pPr>
+        <w:pStyle w:val="ImageCaption"/>
+      </w:pPr>
+      <w:r>
+        <w:t xml:space="preserve">Decision Tree confusion matrix</w:t>
+      </w:r>
+    </w:p>
+    <w:p>
+      <w:pPr>
+        <w:pStyle w:val="CaptionedFigure"/>
+      </w:pPr>
+      <w:r>
+        <w:drawing>
+          <wp:inline>
+            <wp:extent cx="5334000" cy="3464277"/>
+            <wp:effectExtent b="0" l="0" r="0" t="0"/>
+            <wp:docPr descr="Decision Tree ROC curve" title="" id="28" name="Picture"/>
+            <a:graphic>
+              <a:graphicData uri="http://schemas.openxmlformats.org/drawingml/2006/picture">
+                <pic:pic>
+                  <pic:nvPicPr>
+                    <pic:cNvPr descr="../screenshots/model/decision_tree_roc_curve.png" id="29" name="Picture"/>
+                    <pic:cNvPicPr>
+                      <a:picLocks noChangeArrowheads="1" noChangeAspect="1"/>
+                    </pic:cNvPicPr>
+                  </pic:nvPicPr>
+                  <pic:blipFill>
+                    <a:blip r:embed="rId27"/>
+                    <a:stretch>
+                      <a:fillRect/>
+                    </a:stretch>
+                  </pic:blipFill>
+                  <pic:spPr bwMode="auto">
+                    <a:xfrm>
+                      <a:off x="0" y="0"/>
+                      <a:ext cx="5334000" cy="3464277"/>
+                    </a:xfrm>
+                    <a:prstGeom prst="rect">
+                      <a:avLst/>
+                    </a:prstGeom>
+                    <a:noFill/>
+                    <a:ln w="9525">
+                      <a:noFill/>
+                      <a:headEnd/>
+                      <a:tailEnd/>
+                    </a:ln>
+                  </pic:spPr>
+                </pic:pic>
+              </a:graphicData>
+            </a:graphic>
+          </wp:inline>
+        </w:drawing>
+      </w:r>
+    </w:p>
+    <w:p>
+      <w:pPr>
+        <w:pStyle w:val="ImageCaption"/>
+      </w:pPr>
+      <w:r>
+        <w:t xml:space="preserve">Decision Tree ROC curve</w:t>
+      </w:r>
+    </w:p>
+    <w:p>
+      <w:pPr>
+        <w:pStyle w:val="CaptionedFigure"/>
+      </w:pPr>
+      <w:r>
+        <w:drawing>
+          <wp:inline>
+            <wp:extent cx="5334000" cy="3464277"/>
+            <wp:effectExtent b="0" l="0" r="0" t="0"/>
+            <wp:docPr descr="Decision Tree feature importance" title="" id="31" name="Picture"/>
+            <a:graphic>
+              <a:graphicData uri="http://schemas.openxmlformats.org/drawingml/2006/picture">
+                <pic:pic>
+                  <pic:nvPicPr>
+                    <pic:cNvPr descr="../screenshots/model/decision_tree_feature_importance.png" id="32" name="Picture"/>
+                    <pic:cNvPicPr>
+                      <a:picLocks noChangeArrowheads="1" noChangeAspect="1"/>
+                    </pic:cNvPicPr>
+                  </pic:nvPicPr>
+                  <pic:blipFill>
+                    <a:blip r:embed="rId30"/>
+                    <a:stretch>
+                      <a:fillRect/>
+                    </a:stretch>
+                  </pic:blipFill>
+                  <pic:spPr bwMode="auto">
+                    <a:xfrm>
+                      <a:off x="0" y="0"/>
+                      <a:ext cx="5334000" cy="3464277"/>
+                    </a:xfrm>
+                    <a:prstGeom prst="rect">
+                      <a:avLst/>
+                    </a:prstGeom>
+                    <a:noFill/>
+                    <a:ln w="9525">
+                      <a:noFill/>
+                      <a:headEnd/>
+                      <a:tailEnd/>
+                    </a:ln>
+                  </pic:spPr>
+                </pic:pic>
+              </a:graphicData>
+            </a:graphic>
+          </wp:inline>
+        </w:drawing>
+      </w:r>
+    </w:p>
+    <w:p>
+      <w:pPr>
+        <w:pStyle w:val="ImageCaption"/>
+      </w:pPr>
+      <w:r>
+        <w:t xml:space="preserve">Decision Tree feature importance</w:t>
+      </w:r>
+    </w:p>
+    <w:p>
+      <w:pPr>
+        <w:pStyle w:val="CaptionedFigure"/>
+      </w:pPr>
+      <w:r>
+        <w:drawing>
+          <wp:inline>
+            <wp:extent cx="5334000" cy="3464277"/>
+            <wp:effectExtent b="0" l="0" r="0" t="0"/>
+            <wp:docPr descr="Gradient Boosting confusion matrix" title="" id="34" name="Picture"/>
+            <a:graphic>
+              <a:graphicData uri="http://schemas.openxmlformats.org/drawingml/2006/picture">
+                <pic:pic>
+                  <pic:nvPicPr>
+                    <pic:cNvPr descr="../screenshots/model/gradient_boosting_confusion_matrix.png" id="35" name="Picture"/>
+                    <pic:cNvPicPr>
+                      <a:picLocks noChangeArrowheads="1" noChangeAspect="1"/>
+                    </pic:cNvPicPr>
+                  </pic:nvPicPr>
+                  <pic:blipFill>
+                    <a:blip r:embed="rId33"/>
+                    <a:stretch>
+                      <a:fillRect/>
+                    </a:stretch>
+                  </pic:blipFill>
+                  <pic:spPr bwMode="auto">
+                    <a:xfrm>
+                      <a:off x="0" y="0"/>
+                      <a:ext cx="5334000" cy="3464277"/>
+                    </a:xfrm>
+                    <a:prstGeom prst="rect">
+                      <a:avLst/>
+                    </a:prstGeom>
+                    <a:noFill/>
+                    <a:ln w="9525">
+                      <a:noFill/>
+                      <a:headEnd/>
+                      <a:tailEnd/>
+                    </a:ln>
+                  </pic:spPr>
+                </pic:pic>
+              </a:graphicData>
+            </a:graphic>
+          </wp:inline>
+        </w:drawing>
+      </w:r>
+    </w:p>
+    <w:p>
+      <w:pPr>
+        <w:pStyle w:val="ImageCaption"/>
+      </w:pPr>
+      <w:r>
+        <w:t xml:space="preserve">Gradient Boosting confusion matrix</w:t>
+      </w:r>
+    </w:p>
+    <w:p>
+      <w:pPr>
+        <w:pStyle w:val="CaptionedFigure"/>
+      </w:pPr>
+      <w:r>
+        <w:drawing>
+          <wp:inline>
+            <wp:extent cx="5334000" cy="3464277"/>
+            <wp:effectExtent b="0" l="0" r="0" t="0"/>
+            <wp:docPr descr="Gradient Boosting ROC curve" title="" id="37" name="Picture"/>
+            <a:graphic>
+              <a:graphicData uri="http://schemas.openxmlformats.org/drawingml/2006/picture">
+                <pic:pic>
+                  <pic:nvPicPr>
+                    <pic:cNvPr descr="../screenshots/model/gradient_boosting_roc_curve.png" id="38" name="Picture"/>
+                    <pic:cNvPicPr>
+                      <a:picLocks noChangeArrowheads="1" noChangeAspect="1"/>
+                    </pic:cNvPicPr>
+                  </pic:nvPicPr>
+                  <pic:blipFill>
+                    <a:blip r:embed="rId36"/>
+                    <a:stretch>
+                      <a:fillRect/>
+                    </a:stretch>
+                  </pic:blipFill>
+                  <pic:spPr bwMode="auto">
+                    <a:xfrm>
+                      <a:off x="0" y="0"/>
+                      <a:ext cx="5334000" cy="3464277"/>
+                    </a:xfrm>
+                    <a:prstGeom prst="rect">
+                      <a:avLst/>
+                    </a:prstGeom>
+                    <a:noFill/>
+                    <a:ln w="9525">
+                      <a:noFill/>
+                      <a:headEnd/>
+                      <a:tailEnd/>
+                    </a:ln>
+                  </pic:spPr>
+                </pic:pic>
+              </a:graphicData>
+            </a:graphic>
+          </wp:inline>
+        </w:drawing>
+      </w:r>
+    </w:p>
+    <w:p>
+      <w:pPr>
+        <w:pStyle w:val="ImageCaption"/>
+      </w:pPr>
+      <w:r>
+        <w:t xml:space="preserve">Gradient Boosting ROC curve</w:t>
+      </w:r>
+    </w:p>
+    <w:p>
+      <w:pPr>
+        <w:pStyle w:val="CaptionedFigure"/>
+      </w:pPr>
+      <w:r>
+        <w:drawing>
+          <wp:inline>
+            <wp:extent cx="5334000" cy="3464277"/>
+            <wp:effectExtent b="0" l="0" r="0" t="0"/>
+            <wp:docPr descr="Gradient Boosting feature importance" title="" id="40" name="Picture"/>
+            <a:graphic>
+              <a:graphicData uri="http://schemas.openxmlformats.org/drawingml/2006/picture">
+                <pic:pic>
+                  <pic:nvPicPr>
+                    <pic:cNvPr descr="../screenshots/model/gradient_boosting_feature_importance.png" id="41" name="Picture"/>
+                    <pic:cNvPicPr>
+                      <a:picLocks noChangeArrowheads="1" noChangeAspect="1"/>
+                    </pic:cNvPicPr>
+                  </pic:nvPicPr>
+                  <pic:blipFill>
+                    <a:blip r:embed="rId39"/>
+                    <a:stretch>
+                      <a:fillRect/>
+                    </a:stretch>
+                  </pic:blipFill>
+                  <pic:spPr bwMode="auto">
+                    <a:xfrm>
+                      <a:off x="0" y="0"/>
+                      <a:ext cx="5334000" cy="3464277"/>
+                    </a:xfrm>
+                    <a:prstGeom prst="rect">
+                      <a:avLst/>
+                    </a:prstGeom>
+                    <a:noFill/>
+                    <a:ln w="9525">
+                      <a:noFill/>
+                      <a:headEnd/>
+                      <a:tailEnd/>
+                    </a:ln>
+                  </pic:spPr>
+                </pic:pic>
+              </a:graphicData>
+            </a:graphic>
+          </wp:inline>
+        </w:drawing>
+      </w:r>
+    </w:p>
+    <w:p>
+      <w:pPr>
+        <w:pStyle w:val="ImageCaption"/>
+      </w:pPr>
+      <w:r>
+        <w:t xml:space="preserve">Gradient Boosting feature importance</w:t>
       </w:r>
     </w:p>
     <w:p>
@@ -2074,9 +2449,9 @@
         </w:pict>
       </w:r>
     </w:p>
-    <w:bookmarkEnd w:id="24"/>
-    <w:bookmarkEnd w:id="25"/>
-    <w:bookmarkStart w:id="26" w:name="experiment-tracking-mlflow"/>
+    <w:bookmarkEnd w:id="42"/>
+    <w:bookmarkEnd w:id="43"/>
+    <w:bookmarkStart w:id="50" w:name="experiment-tracking-mlflow"/>
     <w:p>
       <w:pPr>
         <w:pStyle w:val="Heading2"/>
@@ -2346,14 +2721,177 @@
       </w:r>
     </w:p>
     <w:p>
+      <w:pPr>
+        <w:pStyle w:val="FirstParagraph"/>
+      </w:pPr>
+      <w:r>
+        <w:t xml:space="preserve">Side-by-side run comparison from the MLflow UI (</w:t>
+      </w:r>
+      <w:r>
+        <w:rPr>
+          <w:rStyle w:val="VerbatimChar"/>
+        </w:rPr>
+        <w:t xml:space="preserve">gradient_boosting</w:t>
+      </w:r>
+      <w:r>
+        <w:t xml:space="preserve"> </w:t>
+      </w:r>
+      <w:r>
+        <w:t xml:space="preserve">vs.</w:t>
+      </w:r>
+      <w:r>
+        <w:t xml:space="preserve"> </w:t>
+      </w:r>
+      <w:r>
+        <w:rPr>
+          <w:rStyle w:val="VerbatimChar"/>
+        </w:rPr>
+        <w:t xml:space="preserve">decision_tree</w:t>
+      </w:r>
+      <w:r>
+        <w:t xml:space="preserve">, matching the results table in Section 4 exactly,</w:t>
+      </w:r>
+      <w:r>
+        <w:t xml:space="preserve"> </w:t>
+      </w:r>
+      <w:r>
+        <w:t xml:space="preserve">including the</w:t>
+      </w:r>
+      <w:r>
+        <w:t xml:space="preserve"> </w:t>
+      </w:r>
+      <w:r>
+        <w:rPr>
+          <w:rStyle w:val="VerbatimChar"/>
+        </w:rPr>
+        <w:t xml:space="preserve">champion=true</w:t>
+      </w:r>
+      <w:r>
+        <w:t xml:space="preserve"> </w:t>
+      </w:r>
+      <w:r>
+        <w:t xml:space="preserve">tag set on the winner):</w:t>
+      </w:r>
+    </w:p>
+    <w:p>
+      <w:pPr>
+        <w:pStyle w:val="CaptionedFigure"/>
+      </w:pPr>
+      <w:r>
+        <w:drawing>
+          <wp:inline>
+            <wp:extent cx="5334000" cy="3464277"/>
+            <wp:effectExtent b="0" l="0" r="0" t="0"/>
+            <wp:docPr descr="MLflow run comparison - parameters and tags" title="" id="45" name="Picture"/>
+            <a:graphic>
+              <a:graphicData uri="http://schemas.openxmlformats.org/drawingml/2006/picture">
+                <pic:pic>
+                  <pic:nvPicPr>
+                    <pic:cNvPr descr="../screenshots/model_comaprision.png" id="46" name="Picture"/>
+                    <pic:cNvPicPr>
+                      <a:picLocks noChangeArrowheads="1" noChangeAspect="1"/>
+                    </pic:cNvPicPr>
+                  </pic:nvPicPr>
+                  <pic:blipFill>
+                    <a:blip r:embed="rId44"/>
+                    <a:stretch>
+                      <a:fillRect/>
+                    </a:stretch>
+                  </pic:blipFill>
+                  <pic:spPr bwMode="auto">
+                    <a:xfrm>
+                      <a:off x="0" y="0"/>
+                      <a:ext cx="5334000" cy="3464277"/>
+                    </a:xfrm>
+                    <a:prstGeom prst="rect">
+                      <a:avLst/>
+                    </a:prstGeom>
+                    <a:noFill/>
+                    <a:ln w="9525">
+                      <a:noFill/>
+                      <a:headEnd/>
+                      <a:tailEnd/>
+                    </a:ln>
+                  </pic:spPr>
+                </pic:pic>
+              </a:graphicData>
+            </a:graphic>
+          </wp:inline>
+        </w:drawing>
+      </w:r>
+    </w:p>
+    <w:p>
+      <w:pPr>
+        <w:pStyle w:val="ImageCaption"/>
+      </w:pPr>
+      <w:r>
+        <w:t xml:space="preserve">MLflow run comparison - parameters and tags</w:t>
+      </w:r>
+    </w:p>
+    <w:p>
+      <w:pPr>
+        <w:pStyle w:val="CaptionedFigure"/>
+      </w:pPr>
+      <w:r>
+        <w:drawing>
+          <wp:inline>
+            <wp:extent cx="5334000" cy="3464277"/>
+            <wp:effectExtent b="0" l="0" r="0" t="0"/>
+            <wp:docPr descr="MLflow run comparison - metrics" title="" id="48" name="Picture"/>
+            <a:graphic>
+              <a:graphicData uri="http://schemas.openxmlformats.org/drawingml/2006/picture">
+                <pic:pic>
+                  <pic:nvPicPr>
+                    <pic:cNvPr descr="../screenshots/model/comparision_matrix.png" id="49" name="Picture"/>
+                    <pic:cNvPicPr>
+                      <a:picLocks noChangeArrowheads="1" noChangeAspect="1"/>
+                    </pic:cNvPicPr>
+                  </pic:nvPicPr>
+                  <pic:blipFill>
+                    <a:blip r:embed="rId47"/>
+                    <a:stretch>
+                      <a:fillRect/>
+                    </a:stretch>
+                  </pic:blipFill>
+                  <pic:spPr bwMode="auto">
+                    <a:xfrm>
+                      <a:off x="0" y="0"/>
+                      <a:ext cx="5334000" cy="3464277"/>
+                    </a:xfrm>
+                    <a:prstGeom prst="rect">
+                      <a:avLst/>
+                    </a:prstGeom>
+                    <a:noFill/>
+                    <a:ln w="9525">
+                      <a:noFill/>
+                      <a:headEnd/>
+                      <a:tailEnd/>
+                    </a:ln>
+                  </pic:spPr>
+                </pic:pic>
+              </a:graphicData>
+            </a:graphic>
+          </wp:inline>
+        </w:drawing>
+      </w:r>
+    </w:p>
+    <w:p>
+      <w:pPr>
+        <w:pStyle w:val="ImageCaption"/>
+      </w:pPr>
+      <w:r>
+        <w:t xml:space="preserve">MLflow run comparison - metrics</w:t>
+      </w:r>
+    </w:p>
+    <w:p>
       <w:r>
         <w:pict>
           <v:rect style="width:0;height:1.5pt" o:hralign="center" o:hrstd="t" o:hr="t"/>
         </w:pict>
       </w:r>
     </w:p>
-    <w:bookmarkEnd w:id="26"/>
-    <w:bookmarkStart w:id="27" w:name="model-packaging-reproducibility"/>
+    <w:bookmarkEnd w:id="50"/>
+    <w:bookmarkStart w:id="51" w:name="model-packaging-reproducibility"/>
     <w:p>
       <w:pPr>
         <w:pStyle w:val="Heading2"/>
@@ -2644,8 +3182,8 @@
         </w:pict>
       </w:r>
     </w:p>
-    <w:bookmarkEnd w:id="27"/>
-    <w:bookmarkStart w:id="28" w:name="testing-cicd"/>
+    <w:bookmarkEnd w:id="51"/>
+    <w:bookmarkStart w:id="52" w:name="testing-cicd"/>
     <w:p>
       <w:pPr>
         <w:pStyle w:val="Heading2"/>
@@ -3125,8 +3663,8 @@
         </w:pict>
       </w:r>
     </w:p>
-    <w:bookmarkEnd w:id="28"/>
-    <w:bookmarkStart w:id="29" w:name="containerization"/>
+    <w:bookmarkEnd w:id="52"/>
+    <w:bookmarkStart w:id="56" w:name="containerization"/>
     <w:p>
       <w:pPr>
         <w:pStyle w:val="Heading2"/>
@@ -3386,6 +3924,87 @@
           <w:rStyle w:val="CommentTok"/>
         </w:rPr>
         <w:t xml:space="preserve"># {"status":"ok","model_ready":true,"model_name":"heart-risk-classifier","model_version":"1"}</w:t>
+      </w:r>
+    </w:p>
+    <w:p>
+      <w:pPr>
+        <w:pStyle w:val="FirstParagraph"/>
+      </w:pPr>
+      <w:r>
+        <w:t xml:space="preserve">The FastAPI interactive docs (Swagger UI), auto-generated from the</w:t>
+      </w:r>
+      <w:r>
+        <w:t xml:space="preserve"> </w:t>
+      </w:r>
+      <w:r>
+        <w:t xml:space="preserve">Pydantic contracts in</w:t>
+      </w:r>
+      <w:r>
+        <w:t xml:space="preserve"> </w:t>
+      </w:r>
+      <w:r>
+        <w:rPr>
+          <w:rStyle w:val="VerbatimChar"/>
+        </w:rPr>
+        <w:t xml:space="preserve">heart_risk/service/contracts.py</w:t>
+      </w:r>
+      <w:r>
+        <w:t xml:space="preserve">:</w:t>
+      </w:r>
+    </w:p>
+    <w:p>
+      <w:pPr>
+        <w:pStyle w:val="CaptionedFigure"/>
+      </w:pPr>
+      <w:r>
+        <w:drawing>
+          <wp:inline>
+            <wp:extent cx="5334000" cy="3464277"/>
+            <wp:effectExtent b="0" l="0" r="0" t="0"/>
+            <wp:docPr descr="FastAPI Swagger UI - Heart Risk Prediction Service" title="" id="54" name="Picture"/>
+            <a:graphic>
+              <a:graphicData uri="http://schemas.openxmlformats.org/drawingml/2006/picture">
+                <pic:pic>
+                  <pic:nvPicPr>
+                    <pic:cNvPr descr="../screenshots/heart_risk_swagger_api.png" id="55" name="Picture"/>
+                    <pic:cNvPicPr>
+                      <a:picLocks noChangeArrowheads="1" noChangeAspect="1"/>
+                    </pic:cNvPicPr>
+                  </pic:nvPicPr>
+                  <pic:blipFill>
+                    <a:blip r:embed="rId53"/>
+                    <a:stretch>
+                      <a:fillRect/>
+                    </a:stretch>
+                  </pic:blipFill>
+                  <pic:spPr bwMode="auto">
+                    <a:xfrm>
+                      <a:off x="0" y="0"/>
+                      <a:ext cx="5334000" cy="3464277"/>
+                    </a:xfrm>
+                    <a:prstGeom prst="rect">
+                      <a:avLst/>
+                    </a:prstGeom>
+                    <a:noFill/>
+                    <a:ln w="9525">
+                      <a:noFill/>
+                      <a:headEnd/>
+                      <a:tailEnd/>
+                    </a:ln>
+                  </pic:spPr>
+                </pic:pic>
+              </a:graphicData>
+            </a:graphic>
+          </wp:inline>
+        </w:drawing>
+      </w:r>
+    </w:p>
+    <w:p>
+      <w:pPr>
+        <w:pStyle w:val="ImageCaption"/>
+      </w:pPr>
+      <w:r>
+        <w:t xml:space="preserve">FastAPI Swagger UI - Heart Risk Prediction Service</w:t>
       </w:r>
     </w:p>
     <w:p>
@@ -3395,8 +4014,8 @@
         </w:pict>
       </w:r>
     </w:p>
-    <w:bookmarkEnd w:id="29"/>
-    <w:bookmarkStart w:id="30" w:name="X42995126051c318abf420ee7c27385f86cf05ef"/>
+    <w:bookmarkEnd w:id="56"/>
+    <w:bookmarkStart w:id="60" w:name="X42995126051c318abf420ee7c27385f86cf05ef"/>
     <w:p>
       <w:pPr>
         <w:pStyle w:val="Heading2"/>
@@ -3798,432 +4417,597 @@
       </w:r>
     </w:p>
     <w:p>
-      <w:r>
-        <w:pict>
-          <v:rect style="width:0;height:1.5pt" o:hralign="center" o:hrstd="t" o:hr="t"/>
-        </w:pict>
-      </w:r>
-    </w:p>
-    <w:bookmarkEnd w:id="30"/>
-    <w:bookmarkStart w:id="31" w:name="monitoring-logging"/>
-    <w:p>
-      <w:pPr>
-        <w:pStyle w:val="Heading2"/>
-      </w:pPr>
-      <w:r>
-        <w:t xml:space="preserve">10. Monitoring &amp; Logging</w:t>
-      </w:r>
-    </w:p>
-    <w:p>
-      <w:pPr>
-        <w:pStyle w:val="FirstParagraph"/>
-      </w:pPr>
-      <w:r>
-        <w:rPr>
-          <w:b/>
-          <w:bCs/>
-        </w:rPr>
-        <w:t xml:space="preserve">Request logging:</w:t>
-      </w:r>
-      <w:r>
-        <w:t xml:space="preserve"> </w:t>
-      </w:r>
-      <w:r>
-        <w:t xml:space="preserve">every request produces a single</w:t>
-      </w:r>
-      <w:r>
-        <w:t xml:space="preserve"> </w:t>
-      </w:r>
-      <w:r>
-        <w:rPr>
-          <w:b/>
-          <w:bCs/>
-        </w:rPr>
-        <w:t xml:space="preserve">structured JSON</w:t>
-      </w:r>
-      <w:r>
-        <w:rPr>
-          <w:b/>
-          <w:bCs/>
-        </w:rPr>
-        <w:t xml:space="preserve"> </w:t>
-      </w:r>
-      <w:r>
-        <w:rPr>
-          <w:b/>
-          <w:bCs/>
-        </w:rPr>
-        <w:t xml:space="preserve">log line</w:t>
-      </w:r>
-      <w:r>
-        <w:t xml:space="preserve"> </w:t>
-      </w:r>
-      <w:r>
-        <w:t xml:space="preserve">(trace id, method, route, status, duration) via a custom</w:t>
-      </w:r>
-      <w:r>
-        <w:t xml:space="preserve"> </w:t>
-      </w:r>
-      <w:r>
-        <w:rPr>
-          <w:rStyle w:val="VerbatimChar"/>
-        </w:rPr>
-        <w:t xml:space="preserve">JsonLogFormatter</w:t>
-      </w:r>
-      <w:r>
-        <w:t xml:space="preserve"> </w:t>
-      </w:r>
-      <w:r>
-        <w:t xml:space="preserve">— closer to what a real log aggregator (Loki,</w:t>
-      </w:r>
-      <w:r>
-        <w:t xml:space="preserve"> </w:t>
-      </w:r>
-      <w:r>
-        <w:t xml:space="preserve">CloudWatch) would expect than a plain f-string.</w:t>
-      </w:r>
-    </w:p>
-    <w:p>
-      <w:pPr>
-        <w:pStyle w:val="BodyText"/>
-      </w:pPr>
-      <w:r>
-        <w:rPr>
-          <w:b/>
-          <w:bCs/>
-        </w:rPr>
-        <w:t xml:space="preserve">Metrics:</w:t>
-      </w:r>
-      <w:r>
-        <w:t xml:space="preserve"> </w:t>
-      </w:r>
-      <w:r>
-        <w:t xml:space="preserve">namespaced</w:t>
-      </w:r>
-      <w:r>
-        <w:t xml:space="preserve"> </w:t>
-      </w:r>
-      <w:r>
-        <w:rPr>
-          <w:rStyle w:val="VerbatimChar"/>
-        </w:rPr>
-        <w:t xml:space="preserve">heart_risk_*</w:t>
-      </w:r>
-      <w:r>
-        <w:t xml:space="preserve"> </w:t>
-      </w:r>
-      <w:r>
-        <w:t xml:space="preserve">Prometheus metrics (to avoid</w:t>
-      </w:r>
-      <w:r>
-        <w:t xml:space="preserve"> </w:t>
-      </w:r>
-      <w:r>
-        <w:t xml:space="preserve">colliding with other services on a shared Prometheus instance):</w:t>
-      </w:r>
-      <w:r>
-        <w:t xml:space="preserve"> </w:t>
-      </w:r>
-      <w:r>
-        <w:t xml:space="preserve">-</w:t>
-      </w:r>
-      <w:r>
-        <w:t xml:space="preserve"> </w:t>
-      </w:r>
-      <w:r>
-        <w:rPr>
-          <w:rStyle w:val="VerbatimChar"/>
-        </w:rPr>
-        <w:t xml:space="preserve">heart_risk_http_requests_total{route,method,status}</w:t>
-      </w:r>
-      <w:r>
-        <w:t xml:space="preserve"> </w:t>
-      </w:r>
-      <w:r>
-        <w:t xml:space="preserve">-</w:t>
-      </w:r>
-      <w:r>
-        <w:t xml:space="preserve"> </w:t>
-      </w:r>
-      <w:r>
-        <w:rPr>
-          <w:rStyle w:val="VerbatimChar"/>
-        </w:rPr>
-        <w:t xml:space="preserve">heart_risk_predictions_total{risk_label}</w:t>
-      </w:r>
-      <w:r>
-        <w:t xml:space="preserve"> </w:t>
-      </w:r>
-      <w:r>
-        <w:t xml:space="preserve">-</w:t>
-      </w:r>
-      <w:r>
-        <w:t xml:space="preserve"> </w:t>
-      </w:r>
-      <w:r>
-        <w:rPr>
-          <w:rStyle w:val="VerbatimChar"/>
-        </w:rPr>
-        <w:t xml:space="preserve">heart_risk_request_duration_seconds{route}</w:t>
-      </w:r>
-    </w:p>
-    <w:p>
-      <w:pPr>
-        <w:pStyle w:val="BodyText"/>
-      </w:pPr>
-      <w:r>
-        <w:rPr>
-          <w:b/>
-          <w:bCs/>
-        </w:rPr>
-        <w:t xml:space="preserve">Deployed stack:</w:t>
-      </w:r>
-      <w:r>
-        <w:t xml:space="preserve"> </w:t>
-      </w:r>
-      <w:r>
-        <w:t xml:space="preserve">Prometheus and Grafana are templated as part of the</w:t>
-      </w:r>
-      <w:r>
-        <w:t xml:space="preserve"> </w:t>
-      </w:r>
-      <w:r>
-        <w:rPr>
-          <w:b/>
-          <w:bCs/>
-        </w:rPr>
-        <w:t xml:space="preserve">same Helm chart</w:t>
-      </w:r>
-      <w:r>
-        <w:t xml:space="preserve"> </w:t>
-      </w:r>
-      <w:r>
-        <w:t xml:space="preserve">as the API (</w:t>
-      </w:r>
-      <w:r>
-        <w:rPr>
-          <w:rStyle w:val="VerbatimChar"/>
-        </w:rPr>
-        <w:t xml:space="preserve">deploy/helm/heart-risk-api/templates/monitoring/</w:t>
-      </w:r>
-      <w:r>
-        <w:t xml:space="preserve">),</w:t>
-      </w:r>
-      <w:r>
-        <w:t xml:space="preserve"> </w:t>
-      </w:r>
-      <w:r>
-        <w:t xml:space="preserve">so</w:t>
-      </w:r>
-      <w:r>
-        <w:t xml:space="preserve"> </w:t>
-      </w:r>
-      <w:r>
-        <w:rPr>
-          <w:rStyle w:val="VerbatimChar"/>
-        </w:rPr>
-        <w:t xml:space="preserve">helm install</w:t>
-      </w:r>
-      <w:r>
-        <w:t xml:space="preserve"> </w:t>
-      </w:r>
-      <w:r>
-        <w:t xml:space="preserve">brings up the entire observability stack alongside the</w:t>
-      </w:r>
-      <w:r>
-        <w:t xml:space="preserve"> </w:t>
-      </w:r>
-      <w:r>
-        <w:t xml:space="preserve">service — no separate manifests to apply. Grafana auto-provisions:</w:t>
-      </w:r>
-      <w:r>
-        <w:t xml:space="preserve"> </w:t>
-      </w:r>
-      <w:r>
-        <w:t xml:space="preserve">- A Prometheus datasource</w:t>
-      </w:r>
-      <w:r>
-        <w:t xml:space="preserve"> </w:t>
-      </w:r>
-      <w:r>
-        <w:t xml:space="preserve">- A</w:t>
-      </w:r>
-      <w:r>
-        <w:t xml:space="preserve"> </w:t>
-      </w:r>
-      <w:r>
-        <w:rPr>
-          <w:b/>
-          <w:bCs/>
-        </w:rPr>
-        <w:t xml:space="preserve">“Heart Risk API — Service Health”</w:t>
-      </w:r>
-      <w:r>
-        <w:t xml:space="preserve"> </w:t>
-      </w:r>
-      <w:r>
-        <w:t xml:space="preserve">dashboard with four panels</w:t>
-      </w:r>
-      <w:r>
-        <w:t xml:space="preserve"> </w:t>
-      </w:r>
-      <w:r>
-        <w:t xml:space="preserve">deliberately varied in type: a predictions-by-label</w:t>
-      </w:r>
-      <w:r>
-        <w:t xml:space="preserve"> </w:t>
-      </w:r>
-      <w:r>
-        <w:rPr>
-          <w:b/>
-          <w:bCs/>
-        </w:rPr>
-        <w:t xml:space="preserve">time series</w:t>
-      </w:r>
-      <w:r>
-        <w:t xml:space="preserve">, a</w:t>
-      </w:r>
-      <w:r>
-        <w:t xml:space="preserve"> </w:t>
-      </w:r>
-      <w:r>
-        <w:t xml:space="preserve">requests-per-route</w:t>
-      </w:r>
-      <w:r>
-        <w:t xml:space="preserve"> </w:t>
-      </w:r>
-      <w:r>
-        <w:rPr>
-          <w:b/>
-          <w:bCs/>
-        </w:rPr>
-        <w:t xml:space="preserve">pie chart</w:t>
-      </w:r>
-      <w:r>
-        <w:t xml:space="preserve">, an average-vs-p99 latency</w:t>
-      </w:r>
-      <w:r>
-        <w:t xml:space="preserve"> </w:t>
-      </w:r>
-      <w:r>
-        <w:rPr>
-          <w:b/>
-          <w:bCs/>
-        </w:rPr>
-        <w:t xml:space="preserve">time series</w:t>
-      </w:r>
-      <w:r>
-        <w:t xml:space="preserve">, and an error-rate</w:t>
-      </w:r>
-      <w:r>
-        <w:t xml:space="preserve"> </w:t>
-      </w:r>
-      <w:r>
-        <w:rPr>
-          <w:b/>
-          <w:bCs/>
-        </w:rPr>
-        <w:t xml:space="preserve">gauge</w:t>
-      </w:r>
-      <w:r>
-        <w:t xml:space="preserve"> </w:t>
-      </w:r>
-      <w:r>
-        <w:t xml:space="preserve">— not just four line</w:t>
-      </w:r>
-      <w:r>
-        <w:t xml:space="preserve"> </w:t>
-      </w:r>
-      <w:r>
-        <w:t xml:space="preserve">charts of different metrics.</w:t>
-      </w:r>
-    </w:p>
-    <w:p>
-      <w:pPr>
-        <w:pStyle w:val="BodyText"/>
-      </w:pPr>
-      <w:r>
-        <w:t xml:space="preserve">Verified live against real traffic generated through the Ingress:</w:t>
-      </w:r>
-      <w:r>
-        <w:t xml:space="preserve"> </w:t>
-      </w:r>
-      <w:r>
-        <w:t xml:space="preserve">Prometheus reports the</w:t>
-      </w:r>
-      <w:r>
-        <w:t xml:space="preserve"> </w:t>
-      </w:r>
-      <w:r>
-        <w:rPr>
-          <w:rStyle w:val="VerbatimChar"/>
-        </w:rPr>
-        <w:t xml:space="preserve">heart-risk-api</w:t>
-      </w:r>
-      <w:r>
-        <w:t xml:space="preserve"> </w:t>
-      </w:r>
-      <w:r>
-        <w:t xml:space="preserve">target as</w:t>
-      </w:r>
-      <w:r>
-        <w:t xml:space="preserve"> </w:t>
-      </w:r>
-      <w:r>
-        <w:rPr>
-          <w:b/>
-          <w:bCs/>
-        </w:rPr>
-        <w:t xml:space="preserve">UP</w:t>
-      </w:r>
-      <w:r>
-        <w:t xml:space="preserve">, and Grafana’s</w:t>
-      </w:r>
-      <w:r>
-        <w:t xml:space="preserve"> </w:t>
-      </w:r>
-      <w:r>
-        <w:t xml:space="preserve">API confirms both the datasource and dashboard are provisioned.</w:t>
-      </w:r>
-    </w:p>
-    <w:p>
-      <w:r>
-        <w:pict>
-          <v:rect style="width:0;height:1.5pt" o:hralign="center" o:hrstd="t" o:hr="t"/>
-        </w:pict>
-      </w:r>
-    </w:p>
-    <w:bookmarkEnd w:id="31"/>
-    <w:bookmarkStart w:id="35" w:name="architecture-diagram"/>
-    <w:p>
-      <w:pPr>
-        <w:pStyle w:val="Heading2"/>
-      </w:pPr>
-      <w:r>
-        <w:t xml:space="preserve">11. Architecture Diagram</w:t>
-      </w:r>
-    </w:p>
-    <w:p>
       <w:pPr>
         <w:pStyle w:val="CaptionedFigure"/>
       </w:pPr>
       <w:r>
         <w:drawing>
           <wp:inline>
-            <wp:extent cx="5334000" cy="8371618"/>
+            <wp:extent cx="5334000" cy="1778000"/>
             <wp:effectExtent b="0" l="0" r="0" t="0"/>
-            <wp:docPr descr="Architecture diagram" title="" id="33" name="Picture"/>
+            <wp:docPr descr="kubectl get pods -n heart-risk - API (2/2) + Prometheus + Grafana all Running" title="" id="58" name="Picture"/>
             <a:graphic>
               <a:graphicData uri="http://schemas.openxmlformats.org/drawingml/2006/picture">
                 <pic:pic>
                   <pic:nvPicPr>
-                    <pic:cNvPr descr="figures/architecture_diagram.png" id="34" name="Picture"/>
+                    <pic:cNvPr descr="../screenshots/k8s-pods.jpg" id="59" name="Picture"/>
                     <pic:cNvPicPr>
                       <a:picLocks noChangeArrowheads="1" noChangeAspect="1"/>
                     </pic:cNvPicPr>
                   </pic:nvPicPr>
                   <pic:blipFill>
-                    <a:blip r:embed="rId32"/>
+                    <a:blip r:embed="rId57"/>
+                    <a:stretch>
+                      <a:fillRect/>
+                    </a:stretch>
+                  </pic:blipFill>
+                  <pic:spPr bwMode="auto">
+                    <a:xfrm>
+                      <a:off x="0" y="0"/>
+                      <a:ext cx="5334000" cy="1778000"/>
+                    </a:xfrm>
+                    <a:prstGeom prst="rect">
+                      <a:avLst/>
+                    </a:prstGeom>
+                    <a:noFill/>
+                    <a:ln w="9525">
+                      <a:noFill/>
+                      <a:headEnd/>
+                      <a:tailEnd/>
+                    </a:ln>
+                  </pic:spPr>
+                </pic:pic>
+              </a:graphicData>
+            </a:graphic>
+          </wp:inline>
+        </w:drawing>
+      </w:r>
+    </w:p>
+    <w:p>
+      <w:pPr>
+        <w:pStyle w:val="ImageCaption"/>
+      </w:pPr>
+      <w:r>
+        <w:t xml:space="preserve">kubectl get pods -n heart-risk - API (2/2) + Prometheus + Grafana all Running</w:t>
+      </w:r>
+    </w:p>
+    <w:p>
+      <w:r>
+        <w:pict>
+          <v:rect style="width:0;height:1.5pt" o:hralign="center" o:hrstd="t" o:hr="t"/>
+        </w:pict>
+      </w:r>
+    </w:p>
+    <w:bookmarkEnd w:id="60"/>
+    <w:bookmarkStart w:id="67" w:name="monitoring-logging"/>
+    <w:p>
+      <w:pPr>
+        <w:pStyle w:val="Heading2"/>
+      </w:pPr>
+      <w:r>
+        <w:t xml:space="preserve">10. Monitoring &amp; Logging</w:t>
+      </w:r>
+    </w:p>
+    <w:p>
+      <w:pPr>
+        <w:pStyle w:val="FirstParagraph"/>
+      </w:pPr>
+      <w:r>
+        <w:rPr>
+          <w:b/>
+          <w:bCs/>
+        </w:rPr>
+        <w:t xml:space="preserve">Request logging:</w:t>
+      </w:r>
+      <w:r>
+        <w:t xml:space="preserve"> </w:t>
+      </w:r>
+      <w:r>
+        <w:t xml:space="preserve">every request produces a single</w:t>
+      </w:r>
+      <w:r>
+        <w:t xml:space="preserve"> </w:t>
+      </w:r>
+      <w:r>
+        <w:rPr>
+          <w:b/>
+          <w:bCs/>
+        </w:rPr>
+        <w:t xml:space="preserve">structured JSON</w:t>
+      </w:r>
+      <w:r>
+        <w:rPr>
+          <w:b/>
+          <w:bCs/>
+        </w:rPr>
+        <w:t xml:space="preserve"> </w:t>
+      </w:r>
+      <w:r>
+        <w:rPr>
+          <w:b/>
+          <w:bCs/>
+        </w:rPr>
+        <w:t xml:space="preserve">log line</w:t>
+      </w:r>
+      <w:r>
+        <w:t xml:space="preserve"> </w:t>
+      </w:r>
+      <w:r>
+        <w:t xml:space="preserve">(trace id, method, route, status, duration) via a custom</w:t>
+      </w:r>
+      <w:r>
+        <w:t xml:space="preserve"> </w:t>
+      </w:r>
+      <w:r>
+        <w:rPr>
+          <w:rStyle w:val="VerbatimChar"/>
+        </w:rPr>
+        <w:t xml:space="preserve">JsonLogFormatter</w:t>
+      </w:r>
+      <w:r>
+        <w:t xml:space="preserve"> </w:t>
+      </w:r>
+      <w:r>
+        <w:t xml:space="preserve">— closer to what a real log aggregator (Loki,</w:t>
+      </w:r>
+      <w:r>
+        <w:t xml:space="preserve"> </w:t>
+      </w:r>
+      <w:r>
+        <w:t xml:space="preserve">CloudWatch) would expect than a plain f-string.</w:t>
+      </w:r>
+    </w:p>
+    <w:p>
+      <w:pPr>
+        <w:pStyle w:val="BodyText"/>
+      </w:pPr>
+      <w:r>
+        <w:rPr>
+          <w:b/>
+          <w:bCs/>
+        </w:rPr>
+        <w:t xml:space="preserve">Metrics:</w:t>
+      </w:r>
+      <w:r>
+        <w:t xml:space="preserve"> </w:t>
+      </w:r>
+      <w:r>
+        <w:t xml:space="preserve">namespaced</w:t>
+      </w:r>
+      <w:r>
+        <w:t xml:space="preserve"> </w:t>
+      </w:r>
+      <w:r>
+        <w:rPr>
+          <w:rStyle w:val="VerbatimChar"/>
+        </w:rPr>
+        <w:t xml:space="preserve">heart_risk_*</w:t>
+      </w:r>
+      <w:r>
+        <w:t xml:space="preserve"> </w:t>
+      </w:r>
+      <w:r>
+        <w:t xml:space="preserve">Prometheus metrics (to avoid</w:t>
+      </w:r>
+      <w:r>
+        <w:t xml:space="preserve"> </w:t>
+      </w:r>
+      <w:r>
+        <w:t xml:space="preserve">colliding with other services on a shared Prometheus instance):</w:t>
+      </w:r>
+      <w:r>
+        <w:t xml:space="preserve"> </w:t>
+      </w:r>
+      <w:r>
+        <w:t xml:space="preserve">-</w:t>
+      </w:r>
+      <w:r>
+        <w:t xml:space="preserve"> </w:t>
+      </w:r>
+      <w:r>
+        <w:rPr>
+          <w:rStyle w:val="VerbatimChar"/>
+        </w:rPr>
+        <w:t xml:space="preserve">heart_risk_http_requests_total{route,method,status}</w:t>
+      </w:r>
+      <w:r>
+        <w:t xml:space="preserve"> </w:t>
+      </w:r>
+      <w:r>
+        <w:t xml:space="preserve">-</w:t>
+      </w:r>
+      <w:r>
+        <w:t xml:space="preserve"> </w:t>
+      </w:r>
+      <w:r>
+        <w:rPr>
+          <w:rStyle w:val="VerbatimChar"/>
+        </w:rPr>
+        <w:t xml:space="preserve">heart_risk_predictions_total{risk_label}</w:t>
+      </w:r>
+      <w:r>
+        <w:t xml:space="preserve"> </w:t>
+      </w:r>
+      <w:r>
+        <w:t xml:space="preserve">-</w:t>
+      </w:r>
+      <w:r>
+        <w:t xml:space="preserve"> </w:t>
+      </w:r>
+      <w:r>
+        <w:rPr>
+          <w:rStyle w:val="VerbatimChar"/>
+        </w:rPr>
+        <w:t xml:space="preserve">heart_risk_request_duration_seconds{route}</w:t>
+      </w:r>
+    </w:p>
+    <w:p>
+      <w:pPr>
+        <w:pStyle w:val="BodyText"/>
+      </w:pPr>
+      <w:r>
+        <w:rPr>
+          <w:b/>
+          <w:bCs/>
+        </w:rPr>
+        <w:t xml:space="preserve">Deployed stack:</w:t>
+      </w:r>
+      <w:r>
+        <w:t xml:space="preserve"> </w:t>
+      </w:r>
+      <w:r>
+        <w:t xml:space="preserve">Prometheus and Grafana are templated as part of the</w:t>
+      </w:r>
+      <w:r>
+        <w:t xml:space="preserve"> </w:t>
+      </w:r>
+      <w:r>
+        <w:rPr>
+          <w:b/>
+          <w:bCs/>
+        </w:rPr>
+        <w:t xml:space="preserve">same Helm chart</w:t>
+      </w:r>
+      <w:r>
+        <w:t xml:space="preserve"> </w:t>
+      </w:r>
+      <w:r>
+        <w:t xml:space="preserve">as the API (</w:t>
+      </w:r>
+      <w:r>
+        <w:rPr>
+          <w:rStyle w:val="VerbatimChar"/>
+        </w:rPr>
+        <w:t xml:space="preserve">deploy/helm/heart-risk-api/templates/monitoring/</w:t>
+      </w:r>
+      <w:r>
+        <w:t xml:space="preserve">),</w:t>
+      </w:r>
+      <w:r>
+        <w:t xml:space="preserve"> </w:t>
+      </w:r>
+      <w:r>
+        <w:t xml:space="preserve">so</w:t>
+      </w:r>
+      <w:r>
+        <w:t xml:space="preserve"> </w:t>
+      </w:r>
+      <w:r>
+        <w:rPr>
+          <w:rStyle w:val="VerbatimChar"/>
+        </w:rPr>
+        <w:t xml:space="preserve">helm install</w:t>
+      </w:r>
+      <w:r>
+        <w:t xml:space="preserve"> </w:t>
+      </w:r>
+      <w:r>
+        <w:t xml:space="preserve">brings up the entire observability stack alongside the</w:t>
+      </w:r>
+      <w:r>
+        <w:t xml:space="preserve"> </w:t>
+      </w:r>
+      <w:r>
+        <w:t xml:space="preserve">service — no separate manifests to apply. Grafana auto-provisions:</w:t>
+      </w:r>
+      <w:r>
+        <w:t xml:space="preserve"> </w:t>
+      </w:r>
+      <w:r>
+        <w:t xml:space="preserve">- A Prometheus datasource</w:t>
+      </w:r>
+      <w:r>
+        <w:t xml:space="preserve"> </w:t>
+      </w:r>
+      <w:r>
+        <w:t xml:space="preserve">- A</w:t>
+      </w:r>
+      <w:r>
+        <w:t xml:space="preserve"> </w:t>
+      </w:r>
+      <w:r>
+        <w:rPr>
+          <w:b/>
+          <w:bCs/>
+        </w:rPr>
+        <w:t xml:space="preserve">“Heart Risk API — Service Health”</w:t>
+      </w:r>
+      <w:r>
+        <w:t xml:space="preserve"> </w:t>
+      </w:r>
+      <w:r>
+        <w:t xml:space="preserve">dashboard with four panels</w:t>
+      </w:r>
+      <w:r>
+        <w:t xml:space="preserve"> </w:t>
+      </w:r>
+      <w:r>
+        <w:t xml:space="preserve">deliberately varied in type: a predictions-by-label</w:t>
+      </w:r>
+      <w:r>
+        <w:t xml:space="preserve"> </w:t>
+      </w:r>
+      <w:r>
+        <w:rPr>
+          <w:b/>
+          <w:bCs/>
+        </w:rPr>
+        <w:t xml:space="preserve">time series</w:t>
+      </w:r>
+      <w:r>
+        <w:t xml:space="preserve">, a</w:t>
+      </w:r>
+      <w:r>
+        <w:t xml:space="preserve"> </w:t>
+      </w:r>
+      <w:r>
+        <w:t xml:space="preserve">requests-per-route</w:t>
+      </w:r>
+      <w:r>
+        <w:t xml:space="preserve"> </w:t>
+      </w:r>
+      <w:r>
+        <w:rPr>
+          <w:b/>
+          <w:bCs/>
+        </w:rPr>
+        <w:t xml:space="preserve">pie chart</w:t>
+      </w:r>
+      <w:r>
+        <w:t xml:space="preserve">, an average-vs-p99 latency</w:t>
+      </w:r>
+      <w:r>
+        <w:t xml:space="preserve"> </w:t>
+      </w:r>
+      <w:r>
+        <w:rPr>
+          <w:b/>
+          <w:bCs/>
+        </w:rPr>
+        <w:t xml:space="preserve">time series</w:t>
+      </w:r>
+      <w:r>
+        <w:t xml:space="preserve">, and an error-rate</w:t>
+      </w:r>
+      <w:r>
+        <w:t xml:space="preserve"> </w:t>
+      </w:r>
+      <w:r>
+        <w:rPr>
+          <w:b/>
+          <w:bCs/>
+        </w:rPr>
+        <w:t xml:space="preserve">gauge</w:t>
+      </w:r>
+      <w:r>
+        <w:t xml:space="preserve"> </w:t>
+      </w:r>
+      <w:r>
+        <w:t xml:space="preserve">— not just four line</w:t>
+      </w:r>
+      <w:r>
+        <w:t xml:space="preserve"> </w:t>
+      </w:r>
+      <w:r>
+        <w:t xml:space="preserve">charts of different metrics.</w:t>
+      </w:r>
+    </w:p>
+    <w:p>
+      <w:pPr>
+        <w:pStyle w:val="BodyText"/>
+      </w:pPr>
+      <w:r>
+        <w:t xml:space="preserve">Verified live against real traffic generated through the Ingress:</w:t>
+      </w:r>
+      <w:r>
+        <w:t xml:space="preserve"> </w:t>
+      </w:r>
+      <w:r>
+        <w:t xml:space="preserve">Prometheus reports the</w:t>
+      </w:r>
+      <w:r>
+        <w:t xml:space="preserve"> </w:t>
+      </w:r>
+      <w:r>
+        <w:rPr>
+          <w:rStyle w:val="VerbatimChar"/>
+        </w:rPr>
+        <w:t xml:space="preserve">heart-risk-api</w:t>
+      </w:r>
+      <w:r>
+        <w:t xml:space="preserve"> </w:t>
+      </w:r>
+      <w:r>
+        <w:t xml:space="preserve">target as</w:t>
+      </w:r>
+      <w:r>
+        <w:t xml:space="preserve"> </w:t>
+      </w:r>
+      <w:r>
+        <w:rPr>
+          <w:b/>
+          <w:bCs/>
+        </w:rPr>
+        <w:t xml:space="preserve">UP</w:t>
+      </w:r>
+      <w:r>
+        <w:t xml:space="preserve">, and Grafana’s</w:t>
+      </w:r>
+      <w:r>
+        <w:t xml:space="preserve"> </w:t>
+      </w:r>
+      <w:r>
+        <w:t xml:space="preserve">API confirms both the datasource and dashboard are provisioned.</w:t>
+      </w:r>
+    </w:p>
+    <w:p>
+      <w:pPr>
+        <w:pStyle w:val="CaptionedFigure"/>
+      </w:pPr>
+      <w:r>
+        <w:drawing>
+          <wp:inline>
+            <wp:extent cx="5334000" cy="3464277"/>
+            <wp:effectExtent b="0" l="0" r="0" t="0"/>
+            <wp:docPr descr="Prometheus targets - heart-risk-api UP" title="" id="62" name="Picture"/>
+            <a:graphic>
+              <a:graphicData uri="http://schemas.openxmlformats.org/drawingml/2006/picture">
+                <pic:pic>
+                  <pic:nvPicPr>
+                    <pic:cNvPr descr="../screenshots/prometheus.png" id="63" name="Picture"/>
+                    <pic:cNvPicPr>
+                      <a:picLocks noChangeArrowheads="1" noChangeAspect="1"/>
+                    </pic:cNvPicPr>
+                  </pic:nvPicPr>
+                  <pic:blipFill>
+                    <a:blip r:embed="rId61"/>
+                    <a:stretch>
+                      <a:fillRect/>
+                    </a:stretch>
+                  </pic:blipFill>
+                  <pic:spPr bwMode="auto">
+                    <a:xfrm>
+                      <a:off x="0" y="0"/>
+                      <a:ext cx="5334000" cy="3464277"/>
+                    </a:xfrm>
+                    <a:prstGeom prst="rect">
+                      <a:avLst/>
+                    </a:prstGeom>
+                    <a:noFill/>
+                    <a:ln w="9525">
+                      <a:noFill/>
+                      <a:headEnd/>
+                      <a:tailEnd/>
+                    </a:ln>
+                  </pic:spPr>
+                </pic:pic>
+              </a:graphicData>
+            </a:graphic>
+          </wp:inline>
+        </w:drawing>
+      </w:r>
+    </w:p>
+    <w:p>
+      <w:pPr>
+        <w:pStyle w:val="ImageCaption"/>
+      </w:pPr>
+      <w:r>
+        <w:t xml:space="preserve">Prometheus targets - heart-risk-api UP</w:t>
+      </w:r>
+    </w:p>
+    <w:p>
+      <w:pPr>
+        <w:pStyle w:val="CaptionedFigure"/>
+      </w:pPr>
+      <w:r>
+        <w:drawing>
+          <wp:inline>
+            <wp:extent cx="5334000" cy="3464277"/>
+            <wp:effectExtent b="0" l="0" r="0" t="0"/>
+            <wp:docPr descr="Grafana - Heart Risk API Service Health dashboard with live data" title="" id="65" name="Picture"/>
+            <a:graphic>
+              <a:graphicData uri="http://schemas.openxmlformats.org/drawingml/2006/picture">
+                <pic:pic>
+                  <pic:nvPicPr>
+                    <pic:cNvPr descr="../screenshots/grafana.png" id="66" name="Picture"/>
+                    <pic:cNvPicPr>
+                      <a:picLocks noChangeArrowheads="1" noChangeAspect="1"/>
+                    </pic:cNvPicPr>
+                  </pic:nvPicPr>
+                  <pic:blipFill>
+                    <a:blip r:embed="rId64"/>
+                    <a:stretch>
+                      <a:fillRect/>
+                    </a:stretch>
+                  </pic:blipFill>
+                  <pic:spPr bwMode="auto">
+                    <a:xfrm>
+                      <a:off x="0" y="0"/>
+                      <a:ext cx="5334000" cy="3464277"/>
+                    </a:xfrm>
+                    <a:prstGeom prst="rect">
+                      <a:avLst/>
+                    </a:prstGeom>
+                    <a:noFill/>
+                    <a:ln w="9525">
+                      <a:noFill/>
+                      <a:headEnd/>
+                      <a:tailEnd/>
+                    </a:ln>
+                  </pic:spPr>
+                </pic:pic>
+              </a:graphicData>
+            </a:graphic>
+          </wp:inline>
+        </w:drawing>
+      </w:r>
+    </w:p>
+    <w:p>
+      <w:pPr>
+        <w:pStyle w:val="ImageCaption"/>
+      </w:pPr>
+      <w:r>
+        <w:t xml:space="preserve">Grafana - Heart Risk API Service Health dashboard with live data</w:t>
+      </w:r>
+    </w:p>
+    <w:p>
+      <w:r>
+        <w:pict>
+          <v:rect style="width:0;height:1.5pt" o:hralign="center" o:hrstd="t" o:hr="t"/>
+        </w:pict>
+      </w:r>
+    </w:p>
+    <w:bookmarkEnd w:id="67"/>
+    <w:bookmarkStart w:id="71" w:name="architecture-diagram"/>
+    <w:p>
+      <w:pPr>
+        <w:pStyle w:val="Heading2"/>
+      </w:pPr>
+      <w:r>
+        <w:t xml:space="preserve">11. Architecture Diagram</w:t>
+      </w:r>
+    </w:p>
+    <w:p>
+      <w:pPr>
+        <w:pStyle w:val="CaptionedFigure"/>
+      </w:pPr>
+      <w:r>
+        <w:drawing>
+          <wp:inline>
+            <wp:extent cx="5334000" cy="8371618"/>
+            <wp:effectExtent b="0" l="0" r="0" t="0"/>
+            <wp:docPr descr="Architecture diagram" title="" id="69" name="Picture"/>
+            <a:graphic>
+              <a:graphicData uri="http://schemas.openxmlformats.org/drawingml/2006/picture">
+                <pic:pic>
+                  <pic:nvPicPr>
+                    <pic:cNvPr descr="figures/architecture_diagram.png" id="70" name="Picture"/>
+                    <pic:cNvPicPr>
+                      <a:picLocks noChangeArrowheads="1" noChangeAspect="1"/>
+                    </pic:cNvPicPr>
+                  </pic:nvPicPr>
+                  <pic:blipFill>
+                    <a:blip r:embed="rId68"/>
                     <a:stretch>
                       <a:fillRect/>
                     </a:stretch>
@@ -4300,8 +5084,8 @@
         </w:pict>
       </w:r>
     </w:p>
-    <w:bookmarkEnd w:id="35"/>
-    <w:bookmarkStart w:id="36" w:name="repository-link"/>
+    <w:bookmarkEnd w:id="71"/>
+    <w:bookmarkStart w:id="72" w:name="repository-link"/>
     <w:p>
       <w:pPr>
         <w:pStyle w:val="Heading2"/>
@@ -4318,8 +5102,8 @@
         <w:t xml:space="preserve">https://github.com/shashankp1502/mlops-assignment</w:t>
       </w:r>
     </w:p>
-    <w:bookmarkEnd w:id="36"/>
-    <w:bookmarkStart w:id="37" w:name="a-note-on-originality"/>
+    <w:bookmarkEnd w:id="72"/>
+    <w:bookmarkStart w:id="73" w:name="a-note-on-originality"/>
     <w:p>
       <w:pPr>
         <w:pStyle w:val="Heading2"/>
@@ -4408,8 +5192,8 @@
         <w:t xml:space="preserve">another student’s work.</w:t>
       </w:r>
     </w:p>
-    <w:bookmarkEnd w:id="37"/>
-    <w:bookmarkEnd w:id="38"/>
+    <w:bookmarkEnd w:id="73"/>
+    <w:bookmarkEnd w:id="74"/>
     <w:sectPr>
       <w:footnotePr>
         <w:numRestart w:val="eachSect"/>

</xml_diff>